<commit_message>
Polish mixer serialization and pause cleanup
</commit_message>
<xml_diff>
--- a/Docs/Report_Андижан_Мухаммед.docx
+++ b/Docs/Report_Андижан_Мухаммед.docx
@@ -2356,7 +2356,7 @@
         <w:br/>
         <w:t xml:space="preserve">            Directory.CreateDirectory("Assets/Scenes");</w:t>
         <w:br/>
-        <w:t xml:space="preserve">            EditorSceneManager.SaveScene(EditorSceneManager.GetActiveScene(),path);</w:t>
+        <w:t xml:space="preserve">            EditorSceneManager.SaveScene(UnityEngine.SceneManagement.SceneManager.GetActiveScene(),path);</w:t>
         <w:br/>
         <w:t xml:space="preserve">        }</w:t>
         <w:br/>
@@ -3631,6 +3631,8 @@
         <w:t xml:space="preserve">        {</w:t>
         <w:br/>
         <w:t xml:space="preserve">            if (vrMenuAction) vrMenuAction.action.performed -= OnVRMenu;</w:t>
+        <w:br/>
+        <w:t xml:space="preserve">            if (IsOpen) Time.timeScale = previousTimeScale;</w:t>
         <w:br/>
         <w:t xml:space="preserve">        }</w:t>
         <w:br/>

</xml_diff>

<commit_message>
Migrate workshop project to Unity 6000.6.0f1 and URP 17.6
</commit_message>
<xml_diff>
--- a/Docs/Report_Андижан_Мухаммед.docx
+++ b/Docs/Report_Андижан_Мухаммед.docx
@@ -45,7 +45,7 @@
     </w:p>
     <w:p>
       <w:r>
-        <w:t>Unity 2022.3.62f1 · URP 14.0.11 · XR Interaction Toolkit 2.5.4</w:t>
+        <w:t>Unity 6000.6.0f1 · URP 17.6.0 · XR Interaction Toolkit 2.6.5</w:t>
       </w:r>
     </w:p>
     <w:p>
@@ -1846,7 +1846,7 @@
         <w:br/>
         <w:t>XR Device Simulator and XRI Default Input Actions are copied from the installed</w:t>
         <w:br/>
-        <w:t>XRI 2.5.4 Samples~ directory at editor setup, including their original metadata.</w:t>
+        <w:t>XRI 2.6.5 Samples~ directory at editor setup, including their original metadata.</w:t>
         <w:br/>
         <w:t>See Packages/manifest.json and the individual installed package LICENSE files.</w:t>
         <w:br/>
@@ -1952,6 +1952,8 @@
         <w:br/>
         <w:t xml:space="preserve">        private const string Generated = "Assets/Generated";</w:t>
         <w:br/>
+        <w:t xml:space="preserve">        private const string SetupVersion = "Unity 6000.6.0f1 / URP 17.6.0 / XRI 2.6.5";</w:t>
+        <w:br/>
         <w:t xml:space="preserve">        public const string CommonScene = "Assets/Scenes/Import_Audio_Андижан.unity";</w:t>
         <w:br/>
         <w:t xml:space="preserve">        public const string VariantScene = "Assets/Scenes/Variant_Андижан.unity";</w:t>
@@ -1973,9 +1975,19 @@
         <w:br/>
         <w:t xml:space="preserve">            {</w:t>
         <w:br/>
-        <w:t xml:space="preserve">                if (Application.isBatchMode || EditorApplication.isPlayingOrWillChangePlaymode ||</w:t>
-        <w:br/>
-        <w:t xml:space="preserve">                    File.Exists(Generated + "/SetupComplete.txt")) return;</w:t>
+        <w:t xml:space="preserve">                if (Application.isBatchMode || EditorApplication.isPlayingOrWillChangePlaymode) return;</w:t>
+        <w:br/>
+        <w:t xml:space="preserve">                if (File.Exists(Generated + "/SetupComplete.txt"))</w:t>
+        <w:br/>
+        <w:t xml:space="preserve">                {</w:t>
+        <w:br/>
+        <w:t xml:space="preserve">                    if (!File.ReadAllText(Generated + "/SetupComplete.txt").Contains(SetupVersion))</w:t>
+        <w:br/>
+        <w:t xml:space="preserve">                        Debug.Log("VR Practice: project upgraded to " + SetupVersion + ". Save your scene changes, then run VR Practice/Build workshop scenes to refresh generated assets.");</w:t>
+        <w:br/>
+        <w:t xml:space="preserve">                    return; // Never overwrite existing user scenes automatically during an upgrade.</w:t>
+        <w:br/>
+        <w:t xml:space="preserve">                }</w:t>
         <w:br/>
         <w:t xml:space="preserve">                try { Build(); }</w:t>
         <w:br/>
@@ -2062,7 +2074,7 @@
         <w:br/>
         <w:t xml:space="preserve">            AssetDatabase.SaveAssets();</w:t>
         <w:br/>
-        <w:t xml:space="preserve">            File.WriteAllText(Generated + "/SetupComplete.txt", "Workshop built from committed source assets.\n");</w:t>
+        <w:t xml:space="preserve">            File.WriteAllText(Generated + "/SetupComplete.txt", SetupVersion + "\nWorkshop built from committed source assets.\n");</w:t>
         <w:br/>
         <w:t xml:space="preserve">            AssetDatabase.Refresh();</w:t>
         <w:br/>
@@ -2772,11 +2784,11 @@
         <w:br/>
         <w:t xml:space="preserve">                EditorSceneManager.OpenScene(path);</w:t>
         <w:br/>
-        <w:t xml:space="preserve">                if(Object.FindObjectsOfType&lt;AudioListener&gt;().Length!=1)throw new InvalidOperationException(path+": expected exactly one listener.");</w:t>
-        <w:br/>
-        <w:t xml:space="preserve">                if(!Object.FindObjectOfType&lt;XROrigin&gt;())throw new InvalidOperationException("Missing XR Origin");</w:t>
-        <w:br/>
-        <w:t xml:space="preserve">                foreach(var source in Object.FindObjectsOfType&lt;AudioSource&gt;())</w:t>
+        <w:t xml:space="preserve">                if(Object.FindObjectsByType&lt;AudioListener&gt;(FindObjectsSortMode.None).Length!=1)throw new InvalidOperationException(path+": expected exactly one listener.");</w:t>
+        <w:br/>
+        <w:t xml:space="preserve">                if(!Object.FindFirstObjectByType&lt;XROrigin&gt;())throw new InvalidOperationException("Missing XR Origin");</w:t>
+        <w:br/>
+        <w:t xml:space="preserve">                foreach(var source in Object.FindObjectsByType&lt;AudioSource&gt;(FindObjectsSortMode.None))</w:t>
         <w:br/>
         <w:t xml:space="preserve">                {</w:t>
         <w:br/>
@@ -2794,13 +2806,13 @@
         <w:br/>
         <w:t xml:space="preserve">                }</w:t>
         <w:br/>
-        <w:t xml:space="preserve">                foreach(var grab in Object.FindObjectsOfType&lt;XRGrabInteractable&gt;())</w:t>
+        <w:t xml:space="preserve">                foreach(var grab in Object.FindObjectsByType&lt;XRGrabInteractable&gt;(FindObjectsSortMode.None))</w:t>
         <w:br/>
         <w:t xml:space="preserve">                    if(!grab.GetComponent&lt;Rigidbody&gt;() || grab.GetComponentsInChildren&lt;Collider&gt;().Length==0 || !grab.GetComponent&lt;ImpactSound&gt;())throw new InvalidOperationException("Incomplete grab: "+grab.name);</w:t>
         <w:br/>
-        <w:t xml:space="preserve">                if(Object.FindObjectOfType&lt;LODGroup&gt;().lodCount!=3)throw new InvalidOperationException("Expected 3 LOD levels");</w:t>
-        <w:br/>
-        <w:t xml:space="preserve">                foreach(var root in Object.FindObjectsOfType&lt;Transform&gt;().Where(t=&gt;t.name.EndsWith(" imported mesh")))</w:t>
+        <w:t xml:space="preserve">                if(Object.FindFirstObjectByType&lt;LODGroup&gt;().lodCount!=3)throw new InvalidOperationException("Expected 3 LOD levels");</w:t>
+        <w:br/>
+        <w:t xml:space="preserve">                foreach(var root in Object.FindObjectsByType&lt;Transform&gt;(FindObjectsSortMode.None).Where(t=&gt;t.name.EndsWith(" imported mesh")))</w:t>
         <w:br/>
         <w:t xml:space="preserve">                    if(root.localScale!=Vector3.one || root.localRotation!=Quaternion.identity)throw new InvalidOperationException("Model transform correction: "+root.name);</w:t>
         <w:br/>
@@ -3261,7 +3273,7 @@
         <w:br/>
         <w:t xml:space="preserve">            held.collisionDetectionMode = originalCollisionMode;</w:t>
         <w:br/>
-        <w:t xml:space="preserve">            if (!originalKinematic) held.velocity = throwObject ? head.transform.forward * 5 : Vector3.zero;</w:t>
+        <w:t xml:space="preserve">            if (!originalKinematic) held.linearVelocity = throwObject ? head.transform.forward * 5 : Vector3.zero;</w:t>
         <w:br/>
         <w:t xml:space="preserve">            held = null; heldAudio = null;</w:t>
         <w:br/>
@@ -3790,9 +3802,9 @@
         <w:br/>
         <w:t xml:space="preserve">            WorkshopBuilder.ValidateScenes();</w:t>
         <w:br/>
-        <w:t xml:space="preserve">            Assert.That(Object.FindObjectsOfType&lt;XRGrabInteractable&gt;().Length,Is.GreaterThanOrEqualTo(6));</w:t>
-        <w:br/>
-        <w:t xml:space="preserve">            foreach(var grab in Object.FindObjectsOfType&lt;XRGrabInteractable&gt;())</w:t>
+        <w:t xml:space="preserve">            Assert.That(Object.FindObjectsByType&lt;XRGrabInteractable&gt;(FindObjectsSortMode.None).Length,Is.GreaterThanOrEqualTo(6));</w:t>
+        <w:br/>
+        <w:t xml:space="preserve">            foreach(var grab in Object.FindObjectsByType&lt;XRGrabInteractable&gt;(FindObjectsSortMode.None))</w:t>
         <w:br/>
         <w:t xml:space="preserve">                foreach(var collider in grab.GetComponentsInChildren&lt;MeshCollider&gt;()) Assert.That(collider.convex,Is.True);</w:t>
         <w:br/>
@@ -3907,7 +3919,7 @@
         <w:br/>
         <w:t xml:space="preserve">            Assert.That(fan.GetCustomCurve(AudioSourceCurveType.CustomRolloff).Evaluate(1),Is.Zero);</w:t>
         <w:br/>
-        <w:t xml:space="preserve">            var moving=Object.FindObjectOfType&lt;OrbitingSource&gt;();Assert.That(moving.speed,Is.InRange(8,10));</w:t>
+        <w:t xml:space="preserve">            var moving=Object.FindFirstObjectByType&lt;OrbitingSource&gt;();Assert.That(moving.speed,Is.InRange(8,10));</w:t>
         <w:br/>
         <w:t xml:space="preserve">            Assert.That(moving.radius,Is.EqualTo(5));Assert.That(moving.GetComponent&lt;AudioSource&gt;().dopplerLevel,Is.EqualTo(1));</w:t>
         <w:br/>

</xml_diff>